<commit_message>
Pin report figures under their own subsections; split the result-view figure
Figures used [!htbp] and drifted past later headings. They are now [H] (float
package), so each sits directly under the subsection it illustrates. The
side-by-side result figure is split into two (7.7 under 7.4.1 Result View,
7.8 under 7.4.2 Reconstructed Components), so the chapter has 10 figures.
Rebuilt PDF (69 pages), folder and FLAT zips.

Co-Authored-By: Claude Sonnet 5 <noreply@anthropic.com>
</commit_message>
<xml_diff>
--- a/Review_files/Phase2_ESA_Report_TEXT_for_similarity_check.docx
+++ b/Review_files/Phase2_ESA_Report_TEXT_for_similarity_check.docx
@@ -3123,23 +3123,7 @@
         <w:jc w:val="both"/>
       </w:pPr>
       <w:r>
-        <w:t>Selecting Result overlays the predictions on the uploaded model (Figure (a)). Components are grouped in the legend by their status. Parts (blue) are components with their expected contacts. Not Assembled (orange, marked with a warning symbol) are components flagged either because they touch nothing or because they have fewer contacts than other instances of the same part. Suggested Shapes (pink) are the geometries proposed for the missing components. Each group can be shown or hidden individually, and the row of buttons beneath the viewer switches whole groups on or off at once. The caption line under the viewer reports the file name and the mesh size that was processed (here 76,996 points and 154,008 faces).</w:t>
-      </w:r>
-    </w:p>
-    <w:p>
-      <w:pPr>
-        <w:pStyle w:val="Heading3"/>
-      </w:pPr>
-      <w:r>
-        <w:t>Reconstructed Components</w:t>
-      </w:r>
-    </w:p>
-    <w:p>
-      <w:pPr>
-        <w:jc w:val="both"/>
-      </w:pPr>
-      <w:r>
-        <w:t>For tool-post assemblies the application additionally reconstructs the missing components and draws them in a separate Reconstructed group, coloured by component category so that fasteners, springs, shafts and the knob can be told apart (Figure (b)). The step is implemented in slot_detector.py and rebuild.py, and works in three stages. First, it locates open seats: cylindrical holes on the host bodies with nothing seated in them, plus positions implied by the rotational symmetry of a hole pattern that has surviving members. Second, it assigns each seat a component family from the seat geometry and the parts around it. Third, it obtains the geometry. Where an identical part survives elsewhere in the upload, its mesh is copied and translated to the empty seat. Otherwise the part is retrieved from the part bank or from a small library of springs, which the bank's watertightness gate cannot hold, using the corpus assemblies most similar to the upload to choose between candidates. Panels (a) and (b) of Figure show the same components in the same positions, under the suggested-shape colouring and the category colouring respectively.</w:t>
+        <w:t>Selecting Result overlays the predictions on the uploaded model (Figure ). Components are grouped in the legend by their status. Parts (blue) are components with their expected contacts. Not Assembled (orange, marked with a warning symbol) are components flagged either because they touch nothing or because they have fewer contacts than other instances of the same part. Suggested Shapes (pink) are the geometries proposed for the missing components. Each group can be shown or hidden individually, and the row of buttons beneath the viewer switches whole groups on or off at once. The caption line under the viewer reports the file name and the mesh size that was processed (here 76,996 points and 154,008 faces).</w:t>
       </w:r>
     </w:p>
     <w:p>
@@ -3147,7 +3131,31 @@
         <w:rPr>
           <w:i/>
         </w:rPr>
-        <w:t>Figure: Result view for the partial tool post. (a) Suggested Shapes group (pink) with the Not Assembled group (orange). (b) The same components in the Reconstructed group, coloured by category.</w:t>
+        <w:t>Figure: Result view of the partial tool post: Parts (blue), Not Assembled (orange) and the Suggested Shapes group (pink).</w:t>
+      </w:r>
+    </w:p>
+    <w:p>
+      <w:pPr>
+        <w:pStyle w:val="Heading3"/>
+      </w:pPr>
+      <w:r>
+        <w:t>Reconstructed Components</w:t>
+      </w:r>
+    </w:p>
+    <w:p>
+      <w:pPr>
+        <w:jc w:val="both"/>
+      </w:pPr>
+      <w:r>
+        <w:t>For tool-post assemblies the application additionally reconstructs the missing components and draws them in a separate Reconstructed group, coloured by component category so that fasteners, springs, shafts and the knob can be told apart (Figure ). The step is implemented in slot_detector.py and rebuild.py, and works in three stages. First, it locates open seats: cylindrical holes on the host bodies with nothing seated in them, plus positions implied by the rotational symmetry of a hole pattern that has surviving members. Second, it assigns each seat a component family from the seat geometry and the parts around it. Third, it obtains the geometry. Where an identical part survives elsewhere in the upload, its mesh is copied and translated to the empty seat. Otherwise the part is retrieved from the part bank or from a small library of springs, which the bank's watertightness gate cannot hold, using the corpus assemblies most similar to the upload to choose between candidates. The components in Figure are in the same positions as the suggested shapes of Figure , drawn under the category colouring instead.</w:t>
+      </w:r>
+    </w:p>
+    <w:p>
+      <w:r>
+        <w:rPr>
+          <w:i/>
+        </w:rPr>
+        <w:t>Figure: The same components in the Reconstructed group, coloured by component category.</w:t>
       </w:r>
     </w:p>
     <w:p>
@@ -3168,7 +3176,7 @@
     </w:p>
     <w:p>
       <w:r>
-        <w:t>[!htbp] (17 components; mean per family, in mm). @L3.6cmC1.2cmL4.6cmC2.0cmC2.0cm@ Family | n | Geometry source | Position | Shape</w:t>
+        <w:t>[H] (17 components; mean per family, in mm). @L3.3cmC0.9cmL5.5cmC1.9cmC1.9cm@ Family | n | Geometry source | Position | Shape</w:t>
       </w:r>
     </w:p>
     <w:p>

</xml_diff>

<commit_message>
Place Figure 7.8 under 7.4.1 next to Figure 7.7
Both result views (suggested shapes and reconstructed components) now sit under
7.4.1 Result View; 7.4.2 keeps the description and accuracy table. Verified
against the compiled PDF: 7.1->7.1, 7.2->7.2.1, 7.3->7.2.2, 7.4->7.2.3,
7.5->7.3.1, 7.6->7.3.2, 7.7 and 7.8->7.4.1, 7.9->7.4.3, 7.10->7.5.

Co-Authored-By: Claude Sonnet 5 <noreply@anthropic.com>
</commit_message>
<xml_diff>
--- a/Review_files/Phase2_ESA_Report_TEXT_for_similarity_check.docx
+++ b/Review_files/Phase2_ESA_Report_TEXT_for_similarity_check.docx
@@ -3136,18 +3136,10 @@
     </w:p>
     <w:p>
       <w:pPr>
-        <w:pStyle w:val="Heading3"/>
-      </w:pPr>
-      <w:r>
-        <w:t>Reconstructed Components</w:t>
-      </w:r>
-    </w:p>
-    <w:p>
-      <w:pPr>
         <w:jc w:val="both"/>
       </w:pPr>
       <w:r>
-        <w:t>For tool-post assemblies the application additionally reconstructs the missing components and draws them in a separate Reconstructed group, coloured by component category so that fasteners, springs, shafts and the knob can be told apart (Figure ). The step is implemented in slot_detector.py and rebuild.py, and works in three stages. First, it locates open seats: cylindrical holes on the host bodies with nothing seated in them, plus positions implied by the rotational symmetry of a hole pattern that has surviving members. Second, it assigns each seat a component family from the seat geometry and the parts around it. Third, it obtains the geometry. Where an identical part survives elsewhere in the upload, its mesh is copied and translated to the empty seat. Otherwise the part is retrieved from the part bank or from a small library of springs, which the bank's watertightness gate cannot hold, using the corpus assemblies most similar to the upload to choose between candidates. The components in Figure are in the same positions as the suggested shapes of Figure , drawn under the category colouring instead.</w:t>
+        <w:t>The same components appear again in the Reconstructed group, coloured by category, in Figure ; how that group is produced is described in Section .</w:t>
       </w:r>
     </w:p>
     <w:p>
@@ -3156,6 +3148,22 @@
           <w:i/>
         </w:rPr>
         <w:t>Figure: The same components in the Reconstructed group, coloured by component category.</w:t>
+      </w:r>
+    </w:p>
+    <w:p>
+      <w:pPr>
+        <w:pStyle w:val="Heading3"/>
+      </w:pPr>
+      <w:r>
+        <w:t>Reconstructed Components</w:t>
+      </w:r>
+    </w:p>
+    <w:p>
+      <w:pPr>
+        <w:jc w:val="both"/>
+      </w:pPr>
+      <w:r>
+        <w:t>For tool-post assemblies the application additionally reconstructs the missing components and draws them in a separate Reconstructed group, coloured by component category so that fasteners, springs, shafts and the knob can be told apart (Figure ). The step is implemented in slot_detector.py and rebuild.py, and works in three stages. First, it locates open seats: cylindrical holes on the host bodies with nothing seated in them, plus positions implied by the rotational symmetry of a hole pattern that has surviving members. Second, it assigns each seat a component family from the seat geometry and the parts around it. Third, it obtains the geometry. Where an identical part survives elsewhere in the upload, its mesh is copied and translated to the empty seat. Otherwise the part is retrieved from the part bank or from a small library of springs, which the bank's watertightness gate cannot hold, using the corpus assemblies most similar to the upload to choose between candidates. The components in Figure , shown above, are in the same positions as the suggested shapes of Figure , drawn under the category colouring instead.</w:t>
       </w:r>
     </w:p>
     <w:p>

</xml_diff>

<commit_message>
Add corpus overview figure to report Section 5.2
Brings the slide-7 corpus visual into the report: a reference image of each of
the seven categories above the usable graphs per category (648 of 749, 86.5%),
gate valves highlighted at 51.4%. Redrawn in a print palette rather than the
slide's dark theme; same data and category order as the deck.

Co-Authored-By: Claude Sonnet 5 <noreply@anthropic.com>
</commit_message>
<xml_diff>
--- a/Review_files/Phase2_ESA_Report_TEXT_for_similarity_check.docx
+++ b/Review_files/Phase2_ESA_Report_TEXT_for_similarity_check.docx
@@ -1826,6 +1826,22 @@
     <w:p>
       <w:r>
         <w:t>Total | 648 | 86.5% | 38.8 | —</w:t>
+      </w:r>
+    </w:p>
+    <w:p>
+      <w:pPr>
+        <w:jc w:val="both"/>
+      </w:pPr>
+      <w:r>
+        <w:t>Figure shows the same composition visually: one reference image of each category, and beneath it the number of usable graphs that category produced from its 107 models, in the same order. Gate valves are the clear outlier at 55 usable graphs (51.4%); the other six categories each yield at least 82%.</w:t>
+      </w:r>
+    </w:p>
+    <w:p>
+      <w:r>
+        <w:rPr>
+          <w:i/>
+        </w:rPr>
+        <w:t>Figure: Corpus overview. Top: a reference image of each of the seven categories. Bottom: usable assembly graphs obtained from the 107 models in each category (648 of 749 in total, 86.5%); gate valves, highlighted, have the lowest yield at 51.4%.</w:t>
       </w:r>
     </w:p>
     <w:p>

</xml_diff>